<commit_message>
Implement email confirmation system and UI improvements
- Add email verification codes for registration and booking flows (3-stage: confirm email -> verify code -> complete)
- Implement SMTP email sending via mail.ru (ConfirmationService)
- Fix flight card "expand from left" trigger (hovering only on left side)
- Add input validation: only digits for passport series and number
- Add page reload after login/registration for immediate data display
- Update BookingModal with email confirmation integration
- Update AuthModal with email verification flow
- Add ConfirmationCode database model and migrations
- Update BookingsController with verification endpoints
- Improve UI responsiveness and form validation"
</commit_message>
<xml_diff>
--- a/Тема проекта (Юров.ПБ-42).docx
+++ b/Тема проекта (Юров.ПБ-42).docx
@@ -290,7 +290,39 @@
                 <w:sz w:val="20"/>
                 <w:szCs w:val="20"/>
               </w:rPr>
-              <w:t>Разработка информационной системы автоматизации продажи авиабилетов и управления рейсами авиакомпании «ZetTechAvio». Веб приложение</w:t>
+              <w:t xml:space="preserve">Разработка </w:t>
+            </w:r>
+            <w:r>
+              <w:rPr>
+                <w:rFonts w:ascii="Times New Roman" w:hAnsi="Times New Roman" w:cs="Times New Roman"/>
+                <w:sz w:val="20"/>
+                <w:szCs w:val="20"/>
+              </w:rPr>
+              <w:t>веб приложения</w:t>
+            </w:r>
+            <w:r>
+              <w:rPr>
+                <w:rFonts w:ascii="Times New Roman" w:hAnsi="Times New Roman" w:cs="Times New Roman"/>
+                <w:sz w:val="20"/>
+                <w:szCs w:val="20"/>
+              </w:rPr>
+              <w:t xml:space="preserve"> </w:t>
+            </w:r>
+            <w:r>
+              <w:rPr>
+                <w:rFonts w:ascii="Times New Roman" w:hAnsi="Times New Roman" w:cs="Times New Roman"/>
+                <w:sz w:val="20"/>
+                <w:szCs w:val="20"/>
+              </w:rPr>
+              <w:t xml:space="preserve">для </w:t>
+            </w:r>
+            <w:r>
+              <w:rPr>
+                <w:rFonts w:ascii="Times New Roman" w:hAnsi="Times New Roman" w:cs="Times New Roman"/>
+                <w:sz w:val="20"/>
+                <w:szCs w:val="20"/>
+              </w:rPr>
+              <w:t xml:space="preserve">автоматизации продажи авиабилетов и управления рейсами авиакомпании «ZetTechAvio». </w:t>
             </w:r>
           </w:p>
         </w:tc>

</xml_diff>